<commit_message>
Updated models, metrics and added wine dataset + outputs
</commit_message>
<xml_diff>
--- a/AdaBoost.docx
+++ b/AdaBoost.docx
@@ -50,7 +50,7 @@
     <w:p>
       <w:r>
         <w:pict w14:anchorId="5B5BE155">
-          <v:rect id="_x0000_i1037" style="width:0;height:1.5pt" o:hralign="center" o:hrstd="t" o:hr="t" fillcolor="#a0a0a0" stroked="f"/>
+          <v:rect id="_x0000_i1025" style="width:0;height:1.5pt" o:hralign="center" o:hrstd="t" o:hr="t" fillcolor="#a0a0a0" stroked="f"/>
         </w:pict>
       </w:r>
     </w:p>
@@ -370,7 +370,7 @@
     <w:p>
       <w:r>
         <w:pict w14:anchorId="6EE0549D">
-          <v:rect id="_x0000_i1038" style="width:0;height:1.5pt" o:hralign="center" o:hrstd="t" o:hr="t" fillcolor="#a0a0a0" stroked="f"/>
+          <v:rect id="_x0000_i1026" style="width:0;height:1.5pt" o:hralign="center" o:hrstd="t" o:hr="t" fillcolor="#a0a0a0" stroked="f"/>
         </w:pict>
       </w:r>
     </w:p>
@@ -1503,7 +1503,7 @@
     <w:p>
       <w:r>
         <w:pict w14:anchorId="5EDEEB01">
-          <v:rect id="_x0000_i1047" style="width:0;height:1.5pt" o:hralign="center" o:hrstd="t" o:hr="t" fillcolor="#a0a0a0" stroked="f"/>
+          <v:rect id="_x0000_i1027" style="width:0;height:1.5pt" o:hralign="center" o:hrstd="t" o:hr="t" fillcolor="#a0a0a0" stroked="f"/>
         </w:pict>
       </w:r>
     </w:p>
@@ -1577,6 +1577,1160 @@
       </w:r>
     </w:p>
     <w:p/>
+    <w:p/>
+    <w:p/>
+    <w:p/>
+    <w:p/>
+    <w:p/>
+    <w:p/>
+    <w:p/>
+    <w:p/>
+    <w:p/>
+    <w:p/>
+    <w:p/>
+    <w:p/>
+    <w:p/>
+    <w:p/>
+    <w:p/>
+    <w:p>
+      <w:r>
+        <w:t>OUTPUT</w:t>
+      </w:r>
+    </w:p>
+    <w:p>
+      <w:r>
+        <w:rPr>
+          <w:rFonts w:ascii="Arial" w:hAnsi="Arial" w:cs="Arial"/>
+        </w:rPr>
+        <w:lastRenderedPageBreak/>
+        <w:t>══════════════════════════════════════════════════════════════</w:t>
+      </w:r>
+    </w:p>
+    <w:p>
+      <w:r>
+        <w:t xml:space="preserve">   ENSEMBLE LEARNING — AdaBoost | Stacking | Blending</w:t>
+      </w:r>
+    </w:p>
+    <w:p>
+      <w:r>
+        <w:rPr>
+          <w:rFonts w:ascii="Arial" w:hAnsi="Arial" w:cs="Arial"/>
+        </w:rPr>
+        <w:t>══════════════════════════════════════════════════════════════</w:t>
+      </w:r>
+    </w:p>
+    <w:p/>
+    <w:p>
+      <w:r>
+        <w:rPr>
+          <w:rFonts w:ascii="Arial" w:hAnsi="Arial" w:cs="Arial"/>
+        </w:rPr>
+        <w:t>══════════════════════════════════════════════════════════════</w:t>
+      </w:r>
+    </w:p>
+    <w:p>
+      <w:r>
+        <w:t xml:space="preserve">   </w:t>
+      </w:r>
+      <w:proofErr w:type="gramStart"/>
+      <w:r>
+        <w:rPr>
+          <w:rFonts w:ascii="Segoe UI Emoji" w:hAnsi="Segoe UI Emoji" w:cs="Segoe UI Emoji"/>
+        </w:rPr>
+        <w:t>📂</w:t>
+      </w:r>
+      <w:r>
+        <w:t xml:space="preserve">  SELECT</w:t>
+      </w:r>
+      <w:proofErr w:type="gramEnd"/>
+      <w:r>
+        <w:t xml:space="preserve"> A DATASET TO RUN</w:t>
+      </w:r>
+    </w:p>
+    <w:p>
+      <w:r>
+        <w:rPr>
+          <w:rFonts w:ascii="Arial" w:hAnsi="Arial" w:cs="Arial"/>
+        </w:rPr>
+        <w:t>══════════════════════════════════════════════════════════════</w:t>
+      </w:r>
+    </w:p>
+    <w:p>
+      <w:r>
+        <w:t xml:space="preserve">   [1]  Wine           — 3 classes  | 178 </w:t>
+      </w:r>
+      <w:proofErr w:type="gramStart"/>
+      <w:r>
+        <w:t>samples  |</w:t>
+      </w:r>
+      <w:proofErr w:type="gramEnd"/>
+      <w:r>
+        <w:t xml:space="preserve"> 13 features</w:t>
+      </w:r>
+    </w:p>
+    <w:p>
+      <w:r>
+        <w:t xml:space="preserve">   [2</w:t>
+      </w:r>
+      <w:proofErr w:type="gramStart"/>
+      <w:r>
+        <w:t>]  Iris</w:t>
+      </w:r>
+      <w:proofErr w:type="gramEnd"/>
+      <w:r>
+        <w:t xml:space="preserve">           — 3 </w:t>
+      </w:r>
+      <w:proofErr w:type="gramStart"/>
+      <w:r>
+        <w:t>classes  |</w:t>
+      </w:r>
+      <w:proofErr w:type="gramEnd"/>
+      <w:r>
+        <w:t xml:space="preserve"> 150 </w:t>
+      </w:r>
+      <w:proofErr w:type="gramStart"/>
+      <w:r>
+        <w:t>samples  |</w:t>
+      </w:r>
+      <w:proofErr w:type="gramEnd"/>
+      <w:r>
+        <w:t xml:space="preserve">  4 features</w:t>
+      </w:r>
+    </w:p>
+    <w:p>
+      <w:r>
+        <w:t xml:space="preserve">   [3</w:t>
+      </w:r>
+      <w:proofErr w:type="gramStart"/>
+      <w:r>
+        <w:t>]  Breast</w:t>
+      </w:r>
+      <w:proofErr w:type="gramEnd"/>
+      <w:r>
+        <w:t xml:space="preserve"> </w:t>
+      </w:r>
+      <w:proofErr w:type="gramStart"/>
+      <w:r>
+        <w:t>Cancer  —</w:t>
+      </w:r>
+      <w:proofErr w:type="gramEnd"/>
+      <w:r>
+        <w:t xml:space="preserve"> 2 </w:t>
+      </w:r>
+      <w:proofErr w:type="gramStart"/>
+      <w:r>
+        <w:t>classes  |</w:t>
+      </w:r>
+      <w:proofErr w:type="gramEnd"/>
+      <w:r>
+        <w:t xml:space="preserve"> 569 </w:t>
+      </w:r>
+      <w:proofErr w:type="gramStart"/>
+      <w:r>
+        <w:t>samples  |</w:t>
+      </w:r>
+      <w:proofErr w:type="gramEnd"/>
+      <w:r>
+        <w:t xml:space="preserve"> 30 features</w:t>
+      </w:r>
+    </w:p>
+    <w:p>
+      <w:r>
+        <w:t xml:space="preserve">   [4</w:t>
+      </w:r>
+      <w:proofErr w:type="gramStart"/>
+      <w:r>
+        <w:t>]  Digits</w:t>
+      </w:r>
+      <w:proofErr w:type="gramEnd"/>
+      <w:r>
+        <w:t xml:space="preserve">         — 10 classes | 1797 samples | 64 features</w:t>
+      </w:r>
+    </w:p>
+    <w:p>
+      <w:r>
+        <w:t xml:space="preserve">   [5</w:t>
+      </w:r>
+      <w:proofErr w:type="gramStart"/>
+      <w:r>
+        <w:t>]  Custom</w:t>
+      </w:r>
+      <w:proofErr w:type="gramEnd"/>
+      <w:r>
+        <w:t xml:space="preserve"> CSV     — your own dataset from data/raw/</w:t>
+      </w:r>
+    </w:p>
+    <w:p>
+      <w:r>
+        <w:t>──────────────────────────────────────────────────────────────</w:t>
+      </w:r>
+    </w:p>
+    <w:p/>
+    <w:p>
+      <w:r>
+        <w:t xml:space="preserve">   Enter number: </w:t>
+      </w:r>
+      <w:proofErr w:type="spellStart"/>
+      <w:r>
+        <w:t>pytest</w:t>
+      </w:r>
+      <w:proofErr w:type="spellEnd"/>
+      <w:r>
+        <w:t xml:space="preserve"> tests/ -v</w:t>
+      </w:r>
+    </w:p>
+    <w:p>
+      <w:r>
+        <w:t xml:space="preserve">   </w:t>
+      </w:r>
+      <w:proofErr w:type="gramStart"/>
+      <w:r>
+        <w:rPr>
+          <w:rFonts w:ascii="Segoe UI Emoji" w:hAnsi="Segoe UI Emoji" w:cs="Segoe UI Emoji"/>
+        </w:rPr>
+        <w:t>❌</w:t>
+      </w:r>
+      <w:r>
+        <w:t xml:space="preserve">  Enter</w:t>
+      </w:r>
+      <w:proofErr w:type="gramEnd"/>
+      <w:r>
+        <w:t xml:space="preserve"> a number between 1 and 5.</w:t>
+      </w:r>
+    </w:p>
+    <w:p/>
+    <w:p>
+      <w:r>
+        <w:t xml:space="preserve">   Enter number: 1</w:t>
+      </w:r>
+    </w:p>
+    <w:p/>
+    <w:p>
+      <w:r>
+        <w:t xml:space="preserve">   </w:t>
+      </w:r>
+      <w:proofErr w:type="gramStart"/>
+      <w:r>
+        <w:rPr>
+          <w:rFonts w:ascii="Segoe UI Emoji" w:hAnsi="Segoe UI Emoji" w:cs="Segoe UI Emoji"/>
+        </w:rPr>
+        <w:t>✅</w:t>
+      </w:r>
+      <w:r>
+        <w:t xml:space="preserve">  Dataset</w:t>
+      </w:r>
+      <w:proofErr w:type="gramEnd"/>
+      <w:r>
+        <w:t xml:space="preserve">   </w:t>
+      </w:r>
+      <w:proofErr w:type="gramStart"/>
+      <w:r>
+        <w:t xml:space="preserve">  :</w:t>
+      </w:r>
+      <w:proofErr w:type="gramEnd"/>
+      <w:r>
+        <w:t xml:space="preserve"> Wine</w:t>
+      </w:r>
+    </w:p>
+    <w:p>
+      <w:r>
+        <w:t xml:space="preserve">   </w:t>
+      </w:r>
+      <w:proofErr w:type="gramStart"/>
+      <w:r>
+        <w:rPr>
+          <w:rFonts w:ascii="Segoe UI Emoji" w:hAnsi="Segoe UI Emoji" w:cs="Segoe UI Emoji"/>
+        </w:rPr>
+        <w:t>📋</w:t>
+      </w:r>
+      <w:r>
+        <w:t xml:space="preserve">  Info</w:t>
+      </w:r>
+      <w:proofErr w:type="gramEnd"/>
+      <w:r>
+        <w:t xml:space="preserve">      </w:t>
+      </w:r>
+      <w:proofErr w:type="gramStart"/>
+      <w:r>
+        <w:t xml:space="preserve">  :</w:t>
+      </w:r>
+      <w:proofErr w:type="gramEnd"/>
+      <w:r>
+        <w:t xml:space="preserve"> 3-class wine cultivar classification — 178 samples, 13 features</w:t>
+      </w:r>
+    </w:p>
+    <w:p>
+      <w:r>
+        <w:t xml:space="preserve">   </w:t>
+      </w:r>
+      <w:r>
+        <w:rPr>
+          <w:rFonts w:ascii="Segoe UI Emoji" w:hAnsi="Segoe UI Emoji" w:cs="Segoe UI Emoji"/>
+        </w:rPr>
+        <w:t>🏷️</w:t>
+      </w:r>
+      <w:r>
+        <w:t xml:space="preserve">   Classes   </w:t>
+      </w:r>
+      <w:proofErr w:type="gramStart"/>
+      <w:r>
+        <w:t xml:space="preserve">  :</w:t>
+      </w:r>
+      <w:proofErr w:type="gramEnd"/>
+      <w:r>
+        <w:t xml:space="preserve"> ['class_0', 'class_1', 'class_2']</w:t>
+      </w:r>
+    </w:p>
+    <w:p>
+      <w:r>
+        <w:t xml:space="preserve">                          class_0 = 59</w:t>
+      </w:r>
+    </w:p>
+    <w:p>
+      <w:r>
+        <w:t xml:space="preserve">                          class_1 = 71</w:t>
+      </w:r>
+    </w:p>
+    <w:p>
+      <w:r>
+        <w:t xml:space="preserve">                          class_2 = 48</w:t>
+      </w:r>
+    </w:p>
+    <w:p/>
+    <w:p>
+      <w:r>
+        <w:t xml:space="preserve">   </w:t>
+      </w:r>
+      <w:proofErr w:type="gramStart"/>
+      <w:r>
+        <w:t>Train :</w:t>
+      </w:r>
+      <w:proofErr w:type="gramEnd"/>
+      <w:r>
+        <w:t xml:space="preserve"> 127 samples</w:t>
+      </w:r>
+    </w:p>
+    <w:p>
+      <w:r>
+        <w:t xml:space="preserve">   Val </w:t>
+      </w:r>
+      <w:proofErr w:type="gramStart"/>
+      <w:r>
+        <w:t xml:space="preserve">  :</w:t>
+      </w:r>
+      <w:proofErr w:type="gramEnd"/>
+      <w:r>
+        <w:t xml:space="preserve"> </w:t>
+      </w:r>
+      <w:proofErr w:type="gramStart"/>
+      <w:r>
+        <w:t>15  samples</w:t>
+      </w:r>
+      <w:proofErr w:type="gramEnd"/>
+    </w:p>
+    <w:p>
+      <w:r>
+        <w:lastRenderedPageBreak/>
+        <w:t xml:space="preserve">   </w:t>
+      </w:r>
+      <w:proofErr w:type="gramStart"/>
+      <w:r>
+        <w:t>Test  :</w:t>
+      </w:r>
+      <w:proofErr w:type="gramEnd"/>
+      <w:r>
+        <w:t xml:space="preserve"> </w:t>
+      </w:r>
+      <w:proofErr w:type="gramStart"/>
+      <w:r>
+        <w:t>36  samples</w:t>
+      </w:r>
+      <w:proofErr w:type="gramEnd"/>
+    </w:p>
+    <w:p>
+      <w:r>
+        <w:t xml:space="preserve">2026/03/12 22:01:25 INFO </w:t>
+      </w:r>
+      <w:proofErr w:type="spellStart"/>
+      <w:proofErr w:type="gramStart"/>
+      <w:r>
+        <w:t>mlflow.tracking</w:t>
+      </w:r>
+      <w:proofErr w:type="gramEnd"/>
+      <w:r>
+        <w:t>.fluent</w:t>
+      </w:r>
+      <w:proofErr w:type="spellEnd"/>
+      <w:r>
+        <w:t>: Experiment with name 'Ensemble-Wine' does not exist. Creating a new experiment.</w:t>
+      </w:r>
+    </w:p>
+    <w:p/>
+    <w:p>
+      <w:r>
+        <w:t>──────────────────────────────────────────────────────────────</w:t>
+      </w:r>
+    </w:p>
+    <w:p>
+      <w:proofErr w:type="gramStart"/>
+      <w:r>
+        <w:rPr>
+          <w:rFonts w:ascii="Segoe UI Emoji" w:hAnsi="Segoe UI Emoji" w:cs="Segoe UI Emoji"/>
+        </w:rPr>
+        <w:t>🔶</w:t>
+      </w:r>
+      <w:r>
+        <w:t xml:space="preserve">  TRAINING</w:t>
+      </w:r>
+      <w:proofErr w:type="gramEnd"/>
+      <w:r>
+        <w:t xml:space="preserve">  </w:t>
+      </w:r>
+      <w:proofErr w:type="gramStart"/>
+      <w:r>
+        <w:t>→  AdaBoost</w:t>
+      </w:r>
+      <w:proofErr w:type="gramEnd"/>
+    </w:p>
+    <w:p>
+      <w:r>
+        <w:t>──────────────────────────────────────────────────────────────</w:t>
+      </w:r>
+    </w:p>
+    <w:p>
+      <w:r>
+        <w:t xml:space="preserve">   Training complete </w:t>
+      </w:r>
+      <w:r>
+        <w:rPr>
+          <w:rFonts w:ascii="Segoe UI Emoji" w:hAnsi="Segoe UI Emoji" w:cs="Segoe UI Emoji"/>
+        </w:rPr>
+        <w:t>✅</w:t>
+      </w:r>
+    </w:p>
+    <w:p/>
+    <w:p>
+      <w:r>
+        <w:t>=======================================================</w:t>
+      </w:r>
+    </w:p>
+    <w:p>
+      <w:r>
+        <w:t xml:space="preserve">   AdaBoost — Results</w:t>
+      </w:r>
+    </w:p>
+    <w:p>
+      <w:r>
+        <w:t>=======================================================</w:t>
+      </w:r>
+    </w:p>
+    <w:p>
+      <w:r>
+        <w:t xml:space="preserve">   </w:t>
+      </w:r>
+      <w:proofErr w:type="gramStart"/>
+      <w:r>
+        <w:t>Accuracy :</w:t>
+      </w:r>
+      <w:proofErr w:type="gramEnd"/>
+      <w:r>
+        <w:t xml:space="preserve">  0.9722</w:t>
+      </w:r>
+    </w:p>
+    <w:p>
+      <w:r>
+        <w:t xml:space="preserve">   F1 </w:t>
+      </w:r>
+      <w:proofErr w:type="gramStart"/>
+      <w:r>
+        <w:t>Score :</w:t>
+      </w:r>
+      <w:proofErr w:type="gramEnd"/>
+      <w:r>
+        <w:t xml:space="preserve">  0.9723</w:t>
+      </w:r>
+    </w:p>
+    <w:p>
+      <w:r>
+        <w:t xml:space="preserve">   AUC-</w:t>
+      </w:r>
+      <w:proofErr w:type="gramStart"/>
+      <w:r>
+        <w:t>ROC  :</w:t>
+      </w:r>
+      <w:proofErr w:type="gramEnd"/>
+      <w:r>
+        <w:t xml:space="preserve">  0.9987</w:t>
+      </w:r>
+    </w:p>
+    <w:p/>
+    <w:p>
+      <w:r>
+        <w:t xml:space="preserve">              precision    </w:t>
+      </w:r>
+      <w:proofErr w:type="gramStart"/>
+      <w:r>
+        <w:t>recall  f</w:t>
+      </w:r>
+      <w:proofErr w:type="gramEnd"/>
+      <w:r>
+        <w:t>1-score   support</w:t>
+      </w:r>
+    </w:p>
+    <w:p/>
+    <w:p>
+      <w:r>
+        <w:t xml:space="preserve">     class_0       0.92      1.00      0.96        12</w:t>
+      </w:r>
+    </w:p>
+    <w:p>
+      <w:r>
+        <w:t xml:space="preserve">     class_1       1.00      0.93      0.96        14</w:t>
+      </w:r>
+    </w:p>
+    <w:p>
+      <w:r>
+        <w:t xml:space="preserve">     class_2       1.00      1.00      1.00        10</w:t>
+      </w:r>
+    </w:p>
+    <w:p/>
+    <w:p>
+      <w:r>
+        <w:t xml:space="preserve">    accuracy                           0.97        36</w:t>
+      </w:r>
+    </w:p>
+    <w:p>
+      <w:r>
+        <w:t xml:space="preserve">   macro </w:t>
+      </w:r>
+      <w:proofErr w:type="spellStart"/>
+      <w:r>
+        <w:t>avg</w:t>
+      </w:r>
+      <w:proofErr w:type="spellEnd"/>
+      <w:r>
+        <w:t xml:space="preserve">       0.97      0.98      0.97        36</w:t>
+      </w:r>
+    </w:p>
+    <w:p>
+      <w:r>
+        <w:t xml:space="preserve">weighted </w:t>
+      </w:r>
+      <w:proofErr w:type="spellStart"/>
+      <w:r>
+        <w:t>avg</w:t>
+      </w:r>
+      <w:proofErr w:type="spellEnd"/>
+      <w:r>
+        <w:t xml:space="preserve">       0.97      0.97      0.97        36</w:t>
+      </w:r>
+    </w:p>
+    <w:p/>
+    <w:p>
+      <w:r>
+        <w:t xml:space="preserve">   Saved → outputs/AdaBoost_confusion_matrix.png</w:t>
+      </w:r>
+    </w:p>
+    <w:p/>
+    <w:p>
+      <w:r>
+        <w:t>──────────────────────────────────────────────────────────────</w:t>
+      </w:r>
+    </w:p>
+    <w:p>
+      <w:proofErr w:type="gramStart"/>
+      <w:r>
+        <w:rPr>
+          <w:rFonts w:ascii="Segoe UI Emoji" w:hAnsi="Segoe UI Emoji" w:cs="Segoe UI Emoji"/>
+        </w:rPr>
+        <w:t>🔷</w:t>
+      </w:r>
+      <w:r>
+        <w:t xml:space="preserve">  TRAINING</w:t>
+      </w:r>
+      <w:proofErr w:type="gramEnd"/>
+      <w:r>
+        <w:t xml:space="preserve">  </w:t>
+      </w:r>
+      <w:proofErr w:type="gramStart"/>
+      <w:r>
+        <w:t>→  Stacking</w:t>
+      </w:r>
+      <w:proofErr w:type="gramEnd"/>
+      <w:r>
+        <w:t xml:space="preserve"> Ensemble</w:t>
+      </w:r>
+    </w:p>
+    <w:p>
+      <w:r>
+        <w:t>──────────────────────────────────────────────────────────────</w:t>
+      </w:r>
+    </w:p>
+    <w:p>
+      <w:r>
+        <w:lastRenderedPageBreak/>
+        <w:t>Training stacking model with 5-fold CV...</w:t>
+      </w:r>
+    </w:p>
+    <w:p>
+      <w:r>
+        <w:t xml:space="preserve">   Training complete </w:t>
+      </w:r>
+      <w:r>
+        <w:rPr>
+          <w:rFonts w:ascii="Segoe UI Emoji" w:hAnsi="Segoe UI Emoji" w:cs="Segoe UI Emoji"/>
+        </w:rPr>
+        <w:t>✅</w:t>
+      </w:r>
+    </w:p>
+    <w:p/>
+    <w:p>
+      <w:r>
+        <w:t>=======================================================</w:t>
+      </w:r>
+    </w:p>
+    <w:p>
+      <w:r>
+        <w:t xml:space="preserve">   Stacking — Results</w:t>
+      </w:r>
+    </w:p>
+    <w:p>
+      <w:r>
+        <w:t>=======================================================</w:t>
+      </w:r>
+    </w:p>
+    <w:p>
+      <w:r>
+        <w:t xml:space="preserve">   </w:t>
+      </w:r>
+      <w:proofErr w:type="gramStart"/>
+      <w:r>
+        <w:t>Accuracy :</w:t>
+      </w:r>
+      <w:proofErr w:type="gramEnd"/>
+      <w:r>
+        <w:t xml:space="preserve">  1.0</w:t>
+      </w:r>
+    </w:p>
+    <w:p>
+      <w:r>
+        <w:t xml:space="preserve">   F1 </w:t>
+      </w:r>
+      <w:proofErr w:type="gramStart"/>
+      <w:r>
+        <w:t>Score :</w:t>
+      </w:r>
+      <w:proofErr w:type="gramEnd"/>
+      <w:r>
+        <w:t xml:space="preserve">  1.0</w:t>
+      </w:r>
+    </w:p>
+    <w:p>
+      <w:r>
+        <w:t xml:space="preserve">   AUC-</w:t>
+      </w:r>
+      <w:proofErr w:type="gramStart"/>
+      <w:r>
+        <w:t>ROC  :</w:t>
+      </w:r>
+      <w:proofErr w:type="gramEnd"/>
+      <w:r>
+        <w:t xml:space="preserve">  1.0</w:t>
+      </w:r>
+    </w:p>
+    <w:p/>
+    <w:p>
+      <w:r>
+        <w:t xml:space="preserve">              precision    </w:t>
+      </w:r>
+      <w:proofErr w:type="gramStart"/>
+      <w:r>
+        <w:t>recall  f</w:t>
+      </w:r>
+      <w:proofErr w:type="gramEnd"/>
+      <w:r>
+        <w:t>1-score   support</w:t>
+      </w:r>
+    </w:p>
+    <w:p/>
+    <w:p>
+      <w:r>
+        <w:t xml:space="preserve">     class_0       1.00      1.00      1.00        12</w:t>
+      </w:r>
+    </w:p>
+    <w:p>
+      <w:r>
+        <w:t xml:space="preserve">     class_1       1.00      1.00      1.00        14</w:t>
+      </w:r>
+    </w:p>
+    <w:p>
+      <w:r>
+        <w:t xml:space="preserve">     class_2       1.00      1.00      1.00        10</w:t>
+      </w:r>
+    </w:p>
+    <w:p/>
+    <w:p>
+      <w:r>
+        <w:t xml:space="preserve">    accuracy                           1.00        36</w:t>
+      </w:r>
+    </w:p>
+    <w:p>
+      <w:r>
+        <w:t xml:space="preserve">   macro </w:t>
+      </w:r>
+      <w:proofErr w:type="spellStart"/>
+      <w:r>
+        <w:t>avg</w:t>
+      </w:r>
+      <w:proofErr w:type="spellEnd"/>
+      <w:r>
+        <w:t xml:space="preserve">       1.00      1.00      1.00        36</w:t>
+      </w:r>
+    </w:p>
+    <w:p>
+      <w:r>
+        <w:t xml:space="preserve">weighted </w:t>
+      </w:r>
+      <w:proofErr w:type="spellStart"/>
+      <w:r>
+        <w:t>avg</w:t>
+      </w:r>
+      <w:proofErr w:type="spellEnd"/>
+      <w:r>
+        <w:t xml:space="preserve">       1.00      1.00      1.00        36</w:t>
+      </w:r>
+    </w:p>
+    <w:p/>
+    <w:p>
+      <w:r>
+        <w:t xml:space="preserve">   Saved → outputs/Stacking_confusion_matrix.png</w:t>
+      </w:r>
+    </w:p>
+    <w:p/>
+    <w:p>
+      <w:r>
+        <w:t>──────────────────────────────────────────────────────────────</w:t>
+      </w:r>
+    </w:p>
+    <w:p>
+      <w:proofErr w:type="gramStart"/>
+      <w:r>
+        <w:rPr>
+          <w:rFonts w:ascii="Segoe UI Emoji" w:hAnsi="Segoe UI Emoji" w:cs="Segoe UI Emoji"/>
+        </w:rPr>
+        <w:t>🟩</w:t>
+      </w:r>
+      <w:r>
+        <w:t xml:space="preserve">  TRAINING</w:t>
+      </w:r>
+      <w:proofErr w:type="gramEnd"/>
+      <w:r>
+        <w:t xml:space="preserve">  </w:t>
+      </w:r>
+      <w:proofErr w:type="gramStart"/>
+      <w:r>
+        <w:t>→  Blending</w:t>
+      </w:r>
+      <w:proofErr w:type="gramEnd"/>
+      <w:r>
+        <w:t xml:space="preserve"> Ensemble</w:t>
+      </w:r>
+    </w:p>
+    <w:p>
+      <w:r>
+        <w:t>──────────────────────────────────────────────────────────────</w:t>
+      </w:r>
+    </w:p>
+    <w:p>
+      <w:r>
+        <w:t>Train: (101, 13), Holdout: (26, 13)</w:t>
+      </w:r>
+    </w:p>
+    <w:p>
+      <w:r>
+        <w:t xml:space="preserve">  Training base model: </w:t>
+      </w:r>
+      <w:proofErr w:type="spellStart"/>
+      <w:r>
+        <w:t>logistic_regression</w:t>
+      </w:r>
+      <w:proofErr w:type="spellEnd"/>
+    </w:p>
+    <w:p>
+      <w:r>
+        <w:t xml:space="preserve">  Training base model: </w:t>
+      </w:r>
+      <w:proofErr w:type="spellStart"/>
+      <w:r>
+        <w:t>svm</w:t>
+      </w:r>
+      <w:proofErr w:type="spellEnd"/>
+    </w:p>
+    <w:p>
+      <w:r>
+        <w:t xml:space="preserve">  Training base model: </w:t>
+      </w:r>
+      <w:proofErr w:type="spellStart"/>
+      <w:r>
+        <w:t>decision_tree</w:t>
+      </w:r>
+      <w:proofErr w:type="spellEnd"/>
+    </w:p>
+    <w:p>
+      <w:r>
+        <w:t xml:space="preserve">  Training base model: </w:t>
+      </w:r>
+      <w:proofErr w:type="spellStart"/>
+      <w:r>
+        <w:t>knn</w:t>
+      </w:r>
+      <w:proofErr w:type="spellEnd"/>
+    </w:p>
+    <w:p>
+      <w:r>
+        <w:t xml:space="preserve">  Training base model: </w:t>
+      </w:r>
+      <w:proofErr w:type="spellStart"/>
+      <w:r>
+        <w:t>xgboost</w:t>
+      </w:r>
+      <w:proofErr w:type="spellEnd"/>
+    </w:p>
+    <w:p>
+      <w:r>
+        <w:lastRenderedPageBreak/>
+        <w:t xml:space="preserve">  Training base model: </w:t>
+      </w:r>
+      <w:proofErr w:type="spellStart"/>
+      <w:r>
+        <w:t>lightgbm</w:t>
+      </w:r>
+      <w:proofErr w:type="spellEnd"/>
+    </w:p>
+    <w:p>
+      <w:r>
+        <w:t>Training meta-learner on holdout predictions...</w:t>
+      </w:r>
+    </w:p>
+    <w:p>
+      <w:r>
+        <w:t>Retraining base models on full data...</w:t>
+      </w:r>
+    </w:p>
+    <w:p>
+      <w:r>
+        <w:t xml:space="preserve">   Training complete </w:t>
+      </w:r>
+      <w:r>
+        <w:rPr>
+          <w:rFonts w:ascii="Segoe UI Emoji" w:hAnsi="Segoe UI Emoji" w:cs="Segoe UI Emoji"/>
+        </w:rPr>
+        <w:t>✅</w:t>
+      </w:r>
+    </w:p>
+    <w:p/>
+    <w:p>
+      <w:r>
+        <w:t>=======================================================</w:t>
+      </w:r>
+    </w:p>
+    <w:p>
+      <w:r>
+        <w:t xml:space="preserve">   Blending — Results</w:t>
+      </w:r>
+    </w:p>
+    <w:p>
+      <w:r>
+        <w:t>=======================================================</w:t>
+      </w:r>
+    </w:p>
+    <w:p>
+      <w:r>
+        <w:t xml:space="preserve">   </w:t>
+      </w:r>
+      <w:proofErr w:type="gramStart"/>
+      <w:r>
+        <w:t>Accuracy :</w:t>
+      </w:r>
+      <w:proofErr w:type="gramEnd"/>
+      <w:r>
+        <w:t xml:space="preserve">  0.7222</w:t>
+      </w:r>
+    </w:p>
+    <w:p>
+      <w:r>
+        <w:t xml:space="preserve">   F1 </w:t>
+      </w:r>
+      <w:proofErr w:type="gramStart"/>
+      <w:r>
+        <w:t>Score :</w:t>
+      </w:r>
+      <w:proofErr w:type="gramEnd"/>
+      <w:r>
+        <w:t xml:space="preserve">  0.6179</w:t>
+      </w:r>
+    </w:p>
+    <w:p>
+      <w:r>
+        <w:t xml:space="preserve">   AUC-</w:t>
+      </w:r>
+      <w:proofErr w:type="gramStart"/>
+      <w:r>
+        <w:t>ROC  :</w:t>
+      </w:r>
+      <w:proofErr w:type="gramEnd"/>
+      <w:r>
+        <w:t xml:space="preserve">  0.8333</w:t>
+      </w:r>
+    </w:p>
+    <w:p/>
+    <w:p>
+      <w:r>
+        <w:t xml:space="preserve">              precision    </w:t>
+      </w:r>
+      <w:proofErr w:type="gramStart"/>
+      <w:r>
+        <w:t>recall  f</w:t>
+      </w:r>
+      <w:proofErr w:type="gramEnd"/>
+      <w:r>
+        <w:t>1-score   support</w:t>
+      </w:r>
+    </w:p>
+    <w:p/>
+    <w:p>
+      <w:r>
+        <w:t xml:space="preserve">     class_0       0.57      1.00      0.73        12</w:t>
+      </w:r>
+    </w:p>
+    <w:p>
+      <w:r>
+        <w:t xml:space="preserve">     class_1       0.93      1.00      0.97        14</w:t>
+      </w:r>
+    </w:p>
+    <w:p>
+      <w:r>
+        <w:t xml:space="preserve">     class_2       0.00      0.00      0.00        10</w:t>
+      </w:r>
+    </w:p>
+    <w:p/>
+    <w:p>
+      <w:r>
+        <w:t xml:space="preserve">    accuracy                           0.72        36</w:t>
+      </w:r>
+    </w:p>
+    <w:p>
+      <w:r>
+        <w:t xml:space="preserve">   macro </w:t>
+      </w:r>
+      <w:proofErr w:type="spellStart"/>
+      <w:r>
+        <w:t>avg</w:t>
+      </w:r>
+      <w:proofErr w:type="spellEnd"/>
+      <w:r>
+        <w:t xml:space="preserve">       0.50      0.67      0.56        36</w:t>
+      </w:r>
+    </w:p>
+    <w:p>
+      <w:r>
+        <w:t xml:space="preserve">weighted </w:t>
+      </w:r>
+      <w:proofErr w:type="spellStart"/>
+      <w:r>
+        <w:t>avg</w:t>
+      </w:r>
+      <w:proofErr w:type="spellEnd"/>
+      <w:r>
+        <w:t xml:space="preserve">       0.55      0.72      0.62        36</w:t>
+      </w:r>
+    </w:p>
+    <w:p/>
+    <w:p>
+      <w:r>
+        <w:t xml:space="preserve">   Saved → outputs/Blending_confusion_matrix.png</w:t>
+      </w:r>
+    </w:p>
+    <w:p/>
+    <w:p>
+      <w:r>
+        <w:t>──────────────────────────────────────────────────────────────</w:t>
+      </w:r>
+    </w:p>
+    <w:p>
+      <w:proofErr w:type="gramStart"/>
+      <w:r>
+        <w:rPr>
+          <w:rFonts w:ascii="Segoe UI Emoji" w:hAnsi="Segoe UI Emoji" w:cs="Segoe UI Emoji"/>
+        </w:rPr>
+        <w:t>📊</w:t>
+      </w:r>
+      <w:r>
+        <w:t xml:space="preserve">  GENERATING</w:t>
+      </w:r>
+      <w:proofErr w:type="gramEnd"/>
+      <w:r>
+        <w:t xml:space="preserve"> CHARTS...</w:t>
+      </w:r>
+    </w:p>
+    <w:p>
+      <w:r>
+        <w:t>──────────────────────────────────────────────────────────────</w:t>
+      </w:r>
+    </w:p>
+    <w:p>
+      <w:r>
+        <w:t xml:space="preserve">   Saved → outputs/roc_curves_all_models.png</w:t>
+      </w:r>
+    </w:p>
+    <w:p>
+      <w:r>
+        <w:t xml:space="preserve">   Saved → outputs/model_comparison.png</w:t>
+      </w:r>
+    </w:p>
+    <w:p/>
+    <w:p>
+      <w:r>
+        <w:t>==============================================================</w:t>
+      </w:r>
+    </w:p>
+    <w:p>
+      <w:r>
+        <w:lastRenderedPageBreak/>
+        <w:t xml:space="preserve">   FINAL MODEL COMPARISON</w:t>
+      </w:r>
+    </w:p>
+    <w:p>
+      <w:r>
+        <w:t>==============================================================</w:t>
+      </w:r>
+    </w:p>
+    <w:p>
+      <w:r>
+        <w:t>Model                    Accuracy   F1 Score    AUC-ROC</w:t>
+      </w:r>
+    </w:p>
+    <w:p>
+      <w:r>
+        <w:t>--------------------------------------------------------------</w:t>
+      </w:r>
+    </w:p>
+    <w:p>
+      <w:r>
+        <w:t>AdaBoost                   0.9722     0.9723     0.9987</w:t>
+      </w:r>
+    </w:p>
+    <w:p>
+      <w:r>
+        <w:t xml:space="preserve">Stacking                      1.0        1.0        </w:t>
+      </w:r>
+      <w:proofErr w:type="gramStart"/>
+      <w:r>
+        <w:t>1.0  ←</w:t>
+      </w:r>
+      <w:proofErr w:type="gramEnd"/>
+      <w:r>
+        <w:t xml:space="preserve"> BEST</w:t>
+      </w:r>
+    </w:p>
+    <w:p>
+      <w:r>
+        <w:t>Blending                   0.7222     0.6179     0.8333</w:t>
+      </w:r>
+    </w:p>
+    <w:p>
+      <w:r>
+        <w:t>==============================================================</w:t>
+      </w:r>
+    </w:p>
+    <w:p/>
+    <w:p>
+      <w:r>
+        <w:rPr>
+          <w:rFonts w:ascii="Arial" w:hAnsi="Arial" w:cs="Arial"/>
+        </w:rPr>
+        <w:t>══════════════════════════════════════════════════════════════</w:t>
+      </w:r>
+    </w:p>
+    <w:p>
+      <w:r>
+        <w:t xml:space="preserve">   </w:t>
+      </w:r>
+      <w:proofErr w:type="gramStart"/>
+      <w:r>
+        <w:rPr>
+          <w:rFonts w:ascii="Segoe UI Emoji" w:hAnsi="Segoe UI Emoji" w:cs="Segoe UI Emoji"/>
+        </w:rPr>
+        <w:t>✅</w:t>
+      </w:r>
+      <w:r>
+        <w:t xml:space="preserve">  ALL</w:t>
+      </w:r>
+      <w:proofErr w:type="gramEnd"/>
+      <w:r>
+        <w:t xml:space="preserve"> DONE!</w:t>
+      </w:r>
+    </w:p>
+    <w:p>
+      <w:r>
+        <w:t>──────────────────────────────────────────────────────────────</w:t>
+      </w:r>
+    </w:p>
+    <w:p>
+      <w:r>
+        <w:t xml:space="preserve">   </w:t>
+      </w:r>
+      <w:proofErr w:type="gramStart"/>
+      <w:r>
+        <w:t>Dataset :</w:t>
+      </w:r>
+      <w:proofErr w:type="gramEnd"/>
+      <w:r>
+        <w:t xml:space="preserve"> Wine</w:t>
+      </w:r>
+    </w:p>
+    <w:p>
+      <w:r>
+        <w:t xml:space="preserve">   outputs/ → confusion matrices, ROC, comparison, CSV</w:t>
+      </w:r>
+    </w:p>
+    <w:p>
+      <w:r>
+        <w:t xml:space="preserve">   </w:t>
+      </w:r>
+      <w:proofErr w:type="spellStart"/>
+      <w:r>
+        <w:t>MLflow</w:t>
+      </w:r>
+      <w:proofErr w:type="spellEnd"/>
+      <w:r>
+        <w:t xml:space="preserve">   → </w:t>
+      </w:r>
+      <w:proofErr w:type="spellStart"/>
+      <w:r>
+        <w:t>mlflow</w:t>
+      </w:r>
+      <w:proofErr w:type="spellEnd"/>
+      <w:r>
+        <w:t xml:space="preserve"> </w:t>
+      </w:r>
+      <w:proofErr w:type="spellStart"/>
+      <w:r>
+        <w:t>ui</w:t>
+      </w:r>
+      <w:proofErr w:type="spellEnd"/>
+      <w:r>
+        <w:t xml:space="preserve"> → http://127.0.0.1:5000</w:t>
+      </w:r>
+    </w:p>
+    <w:p>
+      <w:r>
+        <w:rPr>
+          <w:rFonts w:ascii="Arial" w:hAnsi="Arial" w:cs="Arial"/>
+        </w:rPr>
+        <w:t>══════════════════════════════════════════════════════════════</w:t>
+      </w:r>
+    </w:p>
     <w:sectPr>
       <w:pgSz w:w="11906" w:h="16838"/>
       <w:pgMar w:top="1440" w:right="1440" w:bottom="1440" w:left="1440" w:header="708" w:footer="708" w:gutter="0"/>
@@ -2803,6 +3957,7 @@
   <w:style w:type="character" w:default="1" w:styleId="DefaultParagraphFont">
     <w:name w:val="Default Paragraph Font"/>
     <w:uiPriority w:val="1"/>
+    <w:semiHidden/>
     <w:unhideWhenUsed/>
   </w:style>
   <w:style w:type="table" w:default="1" w:styleId="TableNormal">

</xml_diff>